<commit_message>
Add full Task A exploratory testing section to submission document.
Co-authored-by: Cursor <cursoragent@cursor.com>
</commit_message>
<xml_diff>
--- a/SauceDemo-AI-QA-Submission.docx
+++ b/SauceDemo-AI-QA-Submission.docx
@@ -82,7 +82,1418 @@
           <w:b/>
           <w:sz w:val="32"/>
         </w:rPr>
-        <w:t>2. Task B — Defect report (top 5)</w:t>
+        <w:t>2. Task A — AI-Assisted Exploratory Testing</w:t>
+      </w:r>
+    </w:p>
+    <w:p>
+      <w:pPr>
+        <w:spacing w:after="120"/>
+      </w:pPr>
+      <w:r>
+        <w:rPr>
+          <w:rFonts w:ascii="Calibri" w:hAnsi="Calibri" w:eastAsia="Calibri"/>
+          <w:b w:val="0"/>
+          <w:i w:val="0"/>
+          <w:sz w:val="22"/>
+        </w:rPr>
+        <w:t>Goal: use AI to accelerate exploration of SauceDemo — not to dump a traditional test-case list. AI proposed risks and edge cases; each idea was converted into a live check, then kept, changed, or discarded based on what the app actually does for standard_user.</w:t>
+      </w:r>
+    </w:p>
+    <w:p>
+      <w:pPr>
+        <w:pStyle w:val="Heading2"/>
+      </w:pPr>
+      <w:r>
+        <w:rPr>
+          <w:rFonts w:ascii="Calibri" w:hAnsi="Calibri" w:eastAsia="Calibri"/>
+          <w:b/>
+          <w:sz w:val="26"/>
+        </w:rPr>
+        <w:t>2.1 Approach</w:t>
+      </w:r>
+    </w:p>
+    <w:p>
+      <w:pPr>
+        <w:pStyle w:val="ListBullet"/>
+        <w:spacing w:after="60"/>
+      </w:pPr>
+      <w:r>
+        <w:rPr>
+          <w:rFonts w:ascii="Calibri" w:hAnsi="Calibri" w:eastAsia="Calibri"/>
+          <w:b w:val="0"/>
+          <w:sz w:val="20"/>
+        </w:rPr>
+        <w:t>Explore live app at https://www.saucedemo.com/ with standard_user / secret_sauce.</w:t>
+      </w:r>
+    </w:p>
+    <w:p>
+      <w:pPr>
+        <w:pStyle w:val="ListBullet"/>
+        <w:spacing w:after="60"/>
+      </w:pPr>
+      <w:r>
+        <w:rPr>
+          <w:rFonts w:ascii="Calibri" w:hAnsi="Calibri" w:eastAsia="Calibri"/>
+          <w:b w:val="0"/>
+          <w:sz w:val="20"/>
+        </w:rPr>
+        <w:t>Ask AI for high-risk journeys, functional risks, edge cases, UX/a11y, performance, and follow-up questions.</w:t>
+      </w:r>
+    </w:p>
+    <w:p>
+      <w:pPr>
+        <w:pStyle w:val="ListBullet"/>
+        <w:spacing w:after="60"/>
+      </w:pPr>
+      <w:r>
+        <w:rPr>
+          <w:rFonts w:ascii="Calibri" w:hAnsi="Calibri" w:eastAsia="Calibri"/>
+          <w:b w:val="0"/>
+          <w:sz w:val="20"/>
+        </w:rPr>
+        <w:t>Execute useful suggestions as real tests in the browser.</w:t>
+      </w:r>
+    </w:p>
+    <w:p>
+      <w:pPr>
+        <w:pStyle w:val="ListBullet"/>
+        <w:spacing w:after="60"/>
+      </w:pPr>
+      <w:r>
+        <w:rPr>
+          <w:rFonts w:ascii="Calibri" w:hAnsi="Calibri" w:eastAsia="Calibri"/>
+          <w:b w:val="0"/>
+          <w:sz w:val="20"/>
+        </w:rPr>
+        <w:t>Challenge or discard ideas that are irrelevant, wrong, redundant, or unsupported by the app.</w:t>
+      </w:r>
+    </w:p>
+    <w:p>
+      <w:pPr>
+        <w:pStyle w:val="Heading2"/>
+      </w:pPr>
+      <w:r>
+        <w:rPr>
+          <w:rFonts w:ascii="Calibri" w:hAnsi="Calibri" w:eastAsia="Calibri"/>
+          <w:b/>
+          <w:sz w:val="26"/>
+        </w:rPr>
+        <w:t>2.2 Highest-risk user journeys identified</w:t>
+      </w:r>
+    </w:p>
+    <w:tbl>
+      <w:tblPr>
+        <w:tblStyle w:val="TableGrid"/>
+        <w:tblW w:type="auto" w:w="0"/>
+        <w:tblLook w:firstColumn="1" w:firstRow="1" w:lastColumn="0" w:lastRow="0" w:noHBand="0" w:noVBand="1" w:val="04A0"/>
+      </w:tblPr>
+      <w:tblGrid>
+        <w:gridCol w:w="3312"/>
+        <w:gridCol w:w="3312"/>
+        <w:gridCol w:w="3312"/>
+      </w:tblGrid>
+      <w:tr>
+        <w:tc>
+          <w:tcPr>
+            <w:tcW w:type="dxa" w:w="3312"/>
+            <w:shd w:fill="1F4E79" w:val="clear"/>
+          </w:tcPr>
+          <w:p>
+            <w:r>
+              <w:rPr>
+                <w:rFonts w:ascii="Calibri" w:hAnsi="Calibri" w:eastAsia="Calibri"/>
+                <w:b/>
+                <w:color w:val="FFFFFF"/>
+                <w:sz w:val="18"/>
+              </w:rPr>
+              <w:t>Journey</w:t>
+            </w:r>
+          </w:p>
+        </w:tc>
+        <w:tc>
+          <w:tcPr>
+            <w:tcW w:type="dxa" w:w="3312"/>
+            <w:shd w:fill="1F4E79" w:val="clear"/>
+          </w:tcPr>
+          <w:p>
+            <w:r>
+              <w:rPr>
+                <w:rFonts w:ascii="Calibri" w:hAnsi="Calibri" w:eastAsia="Calibri"/>
+                <w:b/>
+                <w:color w:val="FFFFFF"/>
+                <w:sz w:val="18"/>
+              </w:rPr>
+              <w:t>Why it mattered</w:t>
+            </w:r>
+          </w:p>
+        </w:tc>
+        <w:tc>
+          <w:tcPr>
+            <w:tcW w:type="dxa" w:w="3312"/>
+            <w:shd w:fill="1F4E79" w:val="clear"/>
+          </w:tcPr>
+          <w:p>
+            <w:r>
+              <w:rPr>
+                <w:rFonts w:ascii="Calibri" w:hAnsi="Calibri" w:eastAsia="Calibri"/>
+                <w:b/>
+                <w:color w:val="FFFFFF"/>
+                <w:sz w:val="18"/>
+              </w:rPr>
+              <w:t>Session outcome</w:t>
+            </w:r>
+          </w:p>
+        </w:tc>
+      </w:tr>
+      <w:tr>
+        <w:tc>
+          <w:tcPr>
+            <w:tcW w:type="dxa" w:w="3312"/>
+          </w:tcPr>
+          <w:p>
+            <w:r>
+              <w:rPr>
+                <w:rFonts w:ascii="Calibri" w:hAnsi="Calibri" w:eastAsia="Calibri"/>
+                <w:b w:val="0"/>
+                <w:sz w:val="18"/>
+              </w:rPr>
+              <w:t>Purchase / checkout integrity</w:t>
+            </w:r>
+          </w:p>
+        </w:tc>
+        <w:tc>
+          <w:tcPr>
+            <w:tcW w:type="dxa" w:w="3312"/>
+          </w:tcPr>
+          <w:p>
+            <w:r>
+              <w:rPr>
+                <w:rFonts w:ascii="Calibri" w:hAnsi="Calibri" w:eastAsia="Calibri"/>
+                <w:b w:val="0"/>
+                <w:sz w:val="18"/>
+              </w:rPr>
+              <w:t>Money, order completion, and validation sit here</w:t>
+            </w:r>
+          </w:p>
+        </w:tc>
+        <w:tc>
+          <w:tcPr>
+            <w:tcW w:type="dxa" w:w="3312"/>
+          </w:tcPr>
+          <w:p>
+            <w:r>
+              <w:rPr>
+                <w:rFonts w:ascii="Calibri" w:hAnsi="Calibri" w:eastAsia="Calibri"/>
+                <w:b w:val="0"/>
+                <w:sz w:val="18"/>
+              </w:rPr>
+              <w:t>Highest risk — multiple critical defects (see Task B)</w:t>
+            </w:r>
+          </w:p>
+        </w:tc>
+      </w:tr>
+      <w:tr>
+        <w:tc>
+          <w:tcPr>
+            <w:tcW w:type="dxa" w:w="3312"/>
+          </w:tcPr>
+          <w:p>
+            <w:r>
+              <w:rPr>
+                <w:rFonts w:ascii="Calibri" w:hAnsi="Calibri" w:eastAsia="Calibri"/>
+                <w:b w:val="0"/>
+                <w:sz w:val="18"/>
+              </w:rPr>
+              <w:t>Cart state (add/remove/empty/badge)</w:t>
+            </w:r>
+          </w:p>
+        </w:tc>
+        <w:tc>
+          <w:tcPr>
+            <w:tcW w:type="dxa" w:w="3312"/>
+          </w:tcPr>
+          <w:p>
+            <w:r>
+              <w:rPr>
+                <w:rFonts w:ascii="Calibri" w:hAnsi="Calibri" w:eastAsia="Calibri"/>
+                <w:b w:val="0"/>
+                <w:sz w:val="18"/>
+              </w:rPr>
+              <w:t>Empty-cart checkout and no qty control change purchase semantics</w:t>
+            </w:r>
+          </w:p>
+        </w:tc>
+        <w:tc>
+          <w:tcPr>
+            <w:tcW w:type="dxa" w:w="3312"/>
+          </w:tcPr>
+          <w:p>
+            <w:r>
+              <w:rPr>
+                <w:rFonts w:ascii="Calibri" w:hAnsi="Calibri" w:eastAsia="Calibri"/>
+                <w:b w:val="0"/>
+                <w:sz w:val="18"/>
+              </w:rPr>
+              <w:t>High risk — empty checkout confirmed</w:t>
+            </w:r>
+          </w:p>
+        </w:tc>
+      </w:tr>
+      <w:tr>
+        <w:tc>
+          <w:tcPr>
+            <w:tcW w:type="dxa" w:w="3312"/>
+          </w:tcPr>
+          <w:p>
+            <w:r>
+              <w:rPr>
+                <w:rFonts w:ascii="Calibri" w:hAnsi="Calibri" w:eastAsia="Calibri"/>
+                <w:b w:val="0"/>
+                <w:sz w:val="18"/>
+              </w:rPr>
+              <w:t>Dynamic Catalog (Lazy / Spinner / Slider)</w:t>
+            </w:r>
+          </w:p>
+        </w:tc>
+        <w:tc>
+          <w:tcPr>
+            <w:tcW w:type="dxa" w:w="3312"/>
+          </w:tcPr>
+          <w:p>
+            <w:r>
+              <w:rPr>
+                <w:rFonts w:ascii="Calibri" w:hAnsi="Calibri" w:eastAsia="Calibri"/>
+                <w:b w:val="0"/>
+                <w:sz w:val="18"/>
+              </w:rPr>
+              <w:t>Newer surface with loading, duplicates, a11y, browse-only UX</w:t>
+            </w:r>
+          </w:p>
+        </w:tc>
+        <w:tc>
+          <w:tcPr>
+            <w:tcW w:type="dxa" w:w="3312"/>
+          </w:tcPr>
+          <w:p>
+            <w:r>
+              <w:rPr>
+                <w:rFonts w:ascii="Calibri" w:hAnsi="Calibri" w:eastAsia="Calibri"/>
+                <w:b w:val="0"/>
+                <w:sz w:val="18"/>
+              </w:rPr>
+              <w:t>High risk — duplicate SKUs confirmed</w:t>
+            </w:r>
+          </w:p>
+        </w:tc>
+      </w:tr>
+      <w:tr>
+        <w:tc>
+          <w:tcPr>
+            <w:tcW w:type="dxa" w:w="3312"/>
+          </w:tcPr>
+          <w:p>
+            <w:r>
+              <w:rPr>
+                <w:rFonts w:ascii="Calibri" w:hAnsi="Calibri" w:eastAsia="Calibri"/>
+                <w:b w:val="0"/>
+                <w:sz w:val="18"/>
+              </w:rPr>
+              <w:t>Auth + session guards</w:t>
+            </w:r>
+          </w:p>
+        </w:tc>
+        <w:tc>
+          <w:tcPr>
+            <w:tcW w:type="dxa" w:w="3312"/>
+          </w:tcPr>
+          <w:p>
+            <w:r>
+              <w:rPr>
+                <w:rFonts w:ascii="Calibri" w:hAnsi="Calibri" w:eastAsia="Calibri"/>
+                <w:b w:val="0"/>
+                <w:sz w:val="18"/>
+              </w:rPr>
+              <w:t>Protects all post-login pages</w:t>
+            </w:r>
+          </w:p>
+        </w:tc>
+        <w:tc>
+          <w:tcPr>
+            <w:tcW w:type="dxa" w:w="3312"/>
+          </w:tcPr>
+          <w:p>
+            <w:r>
+              <w:rPr>
+                <w:rFonts w:ascii="Calibri" w:hAnsi="Calibri" w:eastAsia="Calibri"/>
+                <w:b w:val="0"/>
+                <w:sz w:val="18"/>
+              </w:rPr>
+              <w:t>Medium — mostly passed (guards + locked_out_user)</w:t>
+            </w:r>
+          </w:p>
+        </w:tc>
+      </w:tr>
+      <w:tr>
+        <w:tc>
+          <w:tcPr>
+            <w:tcW w:type="dxa" w:w="3312"/>
+          </w:tcPr>
+          <w:p>
+            <w:r>
+              <w:rPr>
+                <w:rFonts w:ascii="Calibri" w:hAnsi="Calibri" w:eastAsia="Calibri"/>
+                <w:b w:val="0"/>
+                <w:sz w:val="18"/>
+              </w:rPr>
+              <w:t>Catalog browse + sort</w:t>
+            </w:r>
+          </w:p>
+        </w:tc>
+        <w:tc>
+          <w:tcPr>
+            <w:tcW w:type="dxa" w:w="3312"/>
+          </w:tcPr>
+          <w:p>
+            <w:r>
+              <w:rPr>
+                <w:rFonts w:ascii="Calibri" w:hAnsi="Calibri" w:eastAsia="Calibri"/>
+                <w:b w:val="0"/>
+                <w:sz w:val="18"/>
+              </w:rPr>
+              <w:t>Core discovery path</w:t>
+            </w:r>
+          </w:p>
+        </w:tc>
+        <w:tc>
+          <w:tcPr>
+            <w:tcW w:type="dxa" w:w="3312"/>
+          </w:tcPr>
+          <w:p>
+            <w:r>
+              <w:rPr>
+                <w:rFonts w:ascii="Calibri" w:hAnsi="Calibri" w:eastAsia="Calibri"/>
+                <w:b w:val="0"/>
+                <w:sz w:val="18"/>
+              </w:rPr>
+              <w:t>Lower risk — sort/tax healthy for standard_user</w:t>
+            </w:r>
+          </w:p>
+        </w:tc>
+      </w:tr>
+    </w:tbl>
+    <w:p/>
+    <w:p>
+      <w:pPr>
+        <w:pStyle w:val="Heading2"/>
+      </w:pPr>
+      <w:r>
+        <w:rPr>
+          <w:rFonts w:ascii="Calibri" w:hAnsi="Calibri" w:eastAsia="Calibri"/>
+          <w:b/>
+          <w:sz w:val="26"/>
+        </w:rPr>
+        <w:t>2.3 What was actually tested (live)</w:t>
+      </w:r>
+    </w:p>
+    <w:p>
+      <w:pPr>
+        <w:pStyle w:val="ListBullet"/>
+        <w:spacing w:after="60"/>
+      </w:pPr>
+      <w:r>
+        <w:rPr>
+          <w:rFonts w:ascii="Calibri" w:hAnsi="Calibri" w:eastAsia="Calibri"/>
+          <w:b w:val="0"/>
+          <w:sz w:val="20"/>
+        </w:rPr>
+        <w:t>Login: empty submit, username-only, password-only, locked_out_user.</w:t>
+      </w:r>
+    </w:p>
+    <w:p>
+      <w:pPr>
+        <w:pStyle w:val="ListBullet"/>
+        <w:spacing w:after="60"/>
+      </w:pPr>
+      <w:r>
+        <w:rPr>
+          <w:rFonts w:ascii="Calibri" w:hAnsi="Calibri" w:eastAsia="Calibri"/>
+          <w:b w:val="0"/>
+          <w:sz w:val="20"/>
+        </w:rPr>
+        <w:t>Inventory: price sort low→high and high→low; add/remove; cart badge.</w:t>
+      </w:r>
+    </w:p>
+    <w:p>
+      <w:pPr>
+        <w:pStyle w:val="ListBullet"/>
+        <w:spacing w:after="60"/>
+      </w:pPr>
+      <w:r>
+        <w:rPr>
+          <w:rFonts w:ascii="Calibri" w:hAnsi="Calibri" w:eastAsia="Calibri"/>
+          <w:b w:val="0"/>
+          <w:sz w:val="20"/>
+        </w:rPr>
+        <w:t>Cart: quantity editability, localStorage cart model, empty-cart checkout.</w:t>
+      </w:r>
+    </w:p>
+    <w:p>
+      <w:pPr>
+        <w:pStyle w:val="ListBullet"/>
+        <w:spacing w:after="60"/>
+      </w:pPr>
+      <w:r>
+        <w:rPr>
+          <w:rFonts w:ascii="Calibri" w:hAnsi="Calibri" w:eastAsia="Calibri"/>
+          <w:b w:val="0"/>
+          <w:sz w:val="20"/>
+        </w:rPr>
+        <w:t>Checkout: whitespace-only names/zip, invalid zip (!!!), tax math, Finish, Back then re-Finish.</w:t>
+      </w:r>
+    </w:p>
+    <w:p>
+      <w:pPr>
+        <w:pStyle w:val="ListBullet"/>
+        <w:spacing w:after="60"/>
+      </w:pPr>
+      <w:r>
+        <w:rPr>
+          <w:rFonts w:ascii="Calibri" w:hAnsi="Calibri" w:eastAsia="Calibri"/>
+          <w:b w:val="0"/>
+          <w:sz w:val="20"/>
+        </w:rPr>
+        <w:t>Order complete: thank-you page; Generate PDF order button state.</w:t>
+      </w:r>
+    </w:p>
+    <w:p>
+      <w:pPr>
+        <w:pStyle w:val="ListBullet"/>
+        <w:spacing w:after="60"/>
+      </w:pPr>
+      <w:r>
+        <w:rPr>
+          <w:rFonts w:ascii="Calibri" w:hAnsi="Calibri" w:eastAsia="Calibri"/>
+          <w:b w:val="0"/>
+          <w:sz w:val="20"/>
+        </w:rPr>
+        <w:t>Auth guards: logout then direct URL to /inventory.html and /checkout-step-one.html.</w:t>
+      </w:r>
+    </w:p>
+    <w:p>
+      <w:pPr>
+        <w:pStyle w:val="ListBullet"/>
+        <w:spacing w:after="60"/>
+      </w:pPr>
+      <w:r>
+        <w:rPr>
+          <w:rFonts w:ascii="Calibri" w:hAnsi="Calibri" w:eastAsia="Calibri"/>
+          <w:b w:val="0"/>
+          <w:sz w:val="20"/>
+        </w:rPr>
+        <w:t>Dynamic Catalog: Lazy Load scroll/duplicates, Spinner page, Slider dots/a11y.</w:t>
+      </w:r>
+    </w:p>
+    <w:p>
+      <w:pPr>
+        <w:pStyle w:val="Heading2"/>
+      </w:pPr>
+      <w:r>
+        <w:rPr>
+          <w:rFonts w:ascii="Calibri" w:hAnsi="Calibri" w:eastAsia="Calibri"/>
+          <w:b/>
+          <w:sz w:val="26"/>
+        </w:rPr>
+        <w:t>2.4 Exploration outcomes (summary)</w:t>
+      </w:r>
+    </w:p>
+    <w:p>
+      <w:pPr>
+        <w:spacing w:after="40"/>
+      </w:pPr>
+      <w:r>
+        <w:rPr>
+          <w:rFonts w:ascii="Calibri" w:hAnsi="Calibri" w:eastAsia="Calibri"/>
+          <w:b/>
+          <w:i w:val="0"/>
+          <w:sz w:val="22"/>
+        </w:rPr>
+        <w:t>Confirmed bugs (detail + evidence in Task B):</w:t>
+      </w:r>
+    </w:p>
+    <w:p>
+      <w:pPr>
+        <w:pStyle w:val="ListBullet"/>
+        <w:spacing w:after="60"/>
+      </w:pPr>
+      <w:r>
+        <w:rPr>
+          <w:rFonts w:ascii="Calibri" w:hAnsi="Calibri" w:eastAsia="Calibri"/>
+          <w:b w:val="0"/>
+          <w:sz w:val="20"/>
+        </w:rPr>
+        <w:t>Empty cart can complete a $0 order.</w:t>
+      </w:r>
+    </w:p>
+    <w:p>
+      <w:pPr>
+        <w:pStyle w:val="ListBullet"/>
+        <w:spacing w:after="60"/>
+      </w:pPr>
+      <w:r>
+        <w:rPr>
+          <w:rFonts w:ascii="Calibri" w:hAnsi="Calibri" w:eastAsia="Calibri"/>
+          <w:b w:val="0"/>
+          <w:sz w:val="20"/>
+        </w:rPr>
+        <w:t>Whitespace-only First/Last/Zip accepted.</w:t>
+      </w:r>
+    </w:p>
+    <w:p>
+      <w:pPr>
+        <w:pStyle w:val="ListBullet"/>
+        <w:spacing w:after="60"/>
+      </w:pPr>
+      <w:r>
+        <w:rPr>
+          <w:rFonts w:ascii="Calibri" w:hAnsi="Calibri" w:eastAsia="Calibri"/>
+          <w:b w:val="0"/>
+          <w:sz w:val="20"/>
+        </w:rPr>
+        <w:t>Postal code accepts “!!!” with no format check.</w:t>
+      </w:r>
+    </w:p>
+    <w:p>
+      <w:pPr>
+        <w:pStyle w:val="ListBullet"/>
+        <w:spacing w:after="60"/>
+      </w:pPr>
+      <w:r>
+        <w:rPr>
+          <w:rFonts w:ascii="Calibri" w:hAnsi="Calibri" w:eastAsia="Calibri"/>
+          <w:b w:val="0"/>
+          <w:sz w:val="20"/>
+        </w:rPr>
+        <w:t>Browser Back after Thank You still allows Finish.</w:t>
+      </w:r>
+    </w:p>
+    <w:p>
+      <w:pPr>
+        <w:pStyle w:val="ListBullet"/>
+        <w:spacing w:after="60"/>
+      </w:pPr>
+      <w:r>
+        <w:rPr>
+          <w:rFonts w:ascii="Calibri" w:hAnsi="Calibri" w:eastAsia="Calibri"/>
+          <w:b w:val="0"/>
+          <w:sz w:val="20"/>
+        </w:rPr>
+        <w:t>Lazy Load catalog duplicates Test.allTheThings() T-Shirt (Red) (L).</w:t>
+      </w:r>
+    </w:p>
+    <w:p>
+      <w:pPr>
+        <w:spacing w:after="40"/>
+      </w:pPr>
+      <w:r>
+        <w:rPr>
+          <w:rFonts w:ascii="Calibri" w:hAnsi="Calibri" w:eastAsia="Calibri"/>
+          <w:b/>
+          <w:i w:val="0"/>
+          <w:sz w:val="22"/>
+        </w:rPr>
+        <w:t>Confirmed passes:</w:t>
+      </w:r>
+    </w:p>
+    <w:p>
+      <w:pPr>
+        <w:pStyle w:val="ListBullet"/>
+        <w:spacing w:after="60"/>
+      </w:pPr>
+      <w:r>
+        <w:rPr>
+          <w:rFonts w:ascii="Calibri" w:hAnsi="Calibri" w:eastAsia="Calibri"/>
+          <w:b w:val="0"/>
+          <w:sz w:val="20"/>
+        </w:rPr>
+        <w:t>Tax math at 8% correct ($29.99 → tax $2.40 → total $32.39; multi-item $79.98 → $6.40 → $86.38).</w:t>
+      </w:r>
+    </w:p>
+    <w:p>
+      <w:pPr>
+        <w:pStyle w:val="ListBullet"/>
+        <w:spacing w:after="60"/>
+      </w:pPr>
+      <w:r>
+        <w:rPr>
+          <w:rFonts w:ascii="Calibri" w:hAnsi="Calibri" w:eastAsia="Calibri"/>
+          <w:b w:val="0"/>
+          <w:sz w:val="20"/>
+        </w:rPr>
+        <w:t>Price sort lohi/hilo correct; cart badge increments on Add.</w:t>
+      </w:r>
+    </w:p>
+    <w:p>
+      <w:pPr>
+        <w:pStyle w:val="ListBullet"/>
+        <w:spacing w:after="60"/>
+      </w:pPr>
+      <w:r>
+        <w:rPr>
+          <w:rFonts w:ascii="Calibri" w:hAnsi="Calibri" w:eastAsia="Calibri"/>
+          <w:b w:val="0"/>
+          <w:sz w:val="20"/>
+        </w:rPr>
+        <w:t>Route guards after logout; locked_out_user blocked.</w:t>
+      </w:r>
+    </w:p>
+    <w:p>
+      <w:pPr>
+        <w:spacing w:after="40"/>
+      </w:pPr>
+      <w:r>
+        <w:rPr>
+          <w:rFonts w:ascii="Calibri" w:hAnsi="Calibri" w:eastAsia="Calibri"/>
+          <w:b/>
+          <w:i w:val="0"/>
+          <w:sz w:val="22"/>
+        </w:rPr>
+        <w:t>Limitations (not filed as defects):</w:t>
+      </w:r>
+    </w:p>
+    <w:p>
+      <w:pPr>
+        <w:pStyle w:val="ListBullet"/>
+        <w:spacing w:after="60"/>
+      </w:pPr>
+      <w:r>
+        <w:rPr>
+          <w:rFonts w:ascii="Calibri" w:hAnsi="Calibri" w:eastAsia="Calibri"/>
+          <w:b w:val="0"/>
+          <w:sz w:val="20"/>
+        </w:rPr>
+        <w:t>Dynamic Catalog pages are browse-only (no Add to cart).</w:t>
+      </w:r>
+    </w:p>
+    <w:p>
+      <w:pPr>
+        <w:pStyle w:val="ListBullet"/>
+        <w:spacing w:after="60"/>
+      </w:pPr>
+      <w:r>
+        <w:rPr>
+          <w:rFonts w:ascii="Calibri" w:hAnsi="Calibri" w:eastAsia="Calibri"/>
+          <w:b w:val="0"/>
+          <w:sz w:val="20"/>
+        </w:rPr>
+        <w:t>Cart quantity cannot exceed 1 (localStorage stores product ID array only).</w:t>
+      </w:r>
+    </w:p>
+    <w:p>
+      <w:pPr>
+        <w:pStyle w:val="Heading2"/>
+      </w:pPr>
+      <w:r>
+        <w:rPr>
+          <w:rFonts w:ascii="Calibri" w:hAnsi="Calibri" w:eastAsia="Calibri"/>
+          <w:b/>
+          <w:sz w:val="26"/>
+        </w:rPr>
+        <w:t>2.5 Representative AI prompts (Task A deliverable)</w:t>
+      </w:r>
+    </w:p>
+    <w:p>
+      <w:pPr>
+        <w:spacing w:after="120"/>
+      </w:pPr>
+      <w:r>
+        <w:rPr>
+          <w:rFonts w:ascii="Calibri" w:hAnsi="Calibri" w:eastAsia="Calibri"/>
+          <w:b w:val="0"/>
+          <w:i w:val="0"/>
+          <w:sz w:val="22"/>
+        </w:rPr>
+        <w:t>Five prompts used to accelerate exploration. For each: purpose, useful AI output, and what was tested / changed / rejected / validated against the live app.</w:t>
+      </w:r>
+    </w:p>
+    <w:p>
+      <w:pPr>
+        <w:pStyle w:val="Heading3"/>
+      </w:pPr>
+      <w:r>
+        <w:rPr>
+          <w:rFonts w:ascii="Calibri" w:hAnsi="Calibri" w:eastAsia="Calibri"/>
+          <w:b/>
+          <w:sz w:val="24"/>
+        </w:rPr>
+        <w:t>Prompt 1 — Risk prioritization</w:t>
+      </w:r>
+    </w:p>
+    <w:p>
+      <w:pPr>
+        <w:spacing w:after="40"/>
+      </w:pPr>
+      <w:r>
+        <w:rPr>
+          <w:rFonts w:ascii="Calibri" w:hAnsi="Calibri" w:eastAsia="Calibri"/>
+          <w:b/>
+          <w:i w:val="0"/>
+          <w:sz w:val="22"/>
+        </w:rPr>
+        <w:t>Prompt:</w:t>
+      </w:r>
+    </w:p>
+    <w:p>
+      <w:pPr>
+        <w:spacing w:after="120"/>
+      </w:pPr>
+      <w:r>
+        <w:rPr>
+          <w:rFonts w:ascii="Calibri" w:hAnsi="Calibri" w:eastAsia="Calibri"/>
+          <w:b w:val="0"/>
+          <w:i/>
+          <w:sz w:val="22"/>
+        </w:rPr>
+        <w:t>“For SauceDemo (saucedemo.com), identify the highest-risk user journeys for standard_user. Prioritize by business/impact risk, not by page count. Challenge assumptions that only apply to real e-commerce backends.”</w:t>
+      </w:r>
+    </w:p>
+    <w:p>
+      <w:pPr>
+        <w:spacing w:after="120"/>
+      </w:pPr>
+      <w:r>
+        <w:rPr>
+          <w:rFonts w:ascii="Calibri" w:hAnsi="Calibri" w:eastAsia="Calibri"/>
+          <w:b w:val="0"/>
+          <w:i w:val="0"/>
+          <w:sz w:val="22"/>
+        </w:rPr>
+        <w:t>Purpose: Focus the session on risk instead of generating a generic test-case list.</w:t>
+      </w:r>
+    </w:p>
+    <w:p>
+      <w:pPr>
+        <w:spacing w:after="120"/>
+      </w:pPr>
+      <w:r>
+        <w:rPr>
+          <w:rFonts w:ascii="Calibri" w:hAnsi="Calibri" w:eastAsia="Calibri"/>
+          <w:b w:val="0"/>
+          <w:i w:val="0"/>
+          <w:sz w:val="22"/>
+        </w:rPr>
+        <w:t>Useful AI output: Ranked checkout/cart as top risk; auth/session next; warned payment may be mocked.</w:t>
+      </w:r>
+    </w:p>
+    <w:p>
+      <w:pPr>
+        <w:spacing w:after="120"/>
+      </w:pPr>
+      <w:r>
+        <w:rPr>
+          <w:rFonts w:ascii="Calibri" w:hAnsi="Calibri" w:eastAsia="Calibri"/>
+          <w:b w:val="0"/>
+          <w:i w:val="0"/>
+          <w:sz w:val="22"/>
+        </w:rPr>
+        <w:t>What I tested / changed / rejected / validated: Validated checkout + cart as highest risk in the live app. Kept auth as medium after logout/direct-URL checks. Rejected deep payment/fraud testing after confirming SauceCard is fake.</w:t>
+      </w:r>
+    </w:p>
+    <w:p>
+      <w:pPr>
+        <w:pStyle w:val="Heading3"/>
+      </w:pPr>
+      <w:r>
+        <w:rPr>
+          <w:rFonts w:ascii="Calibri" w:hAnsi="Calibri" w:eastAsia="Calibri"/>
+          <w:b/>
+          <w:sz w:val="24"/>
+        </w:rPr>
+        <w:t>Prompt 2 — Checkout edge cases</w:t>
+      </w:r>
+    </w:p>
+    <w:p>
+      <w:pPr>
+        <w:spacing w:after="40"/>
+      </w:pPr>
+      <w:r>
+        <w:rPr>
+          <w:rFonts w:ascii="Calibri" w:hAnsi="Calibri" w:eastAsia="Calibri"/>
+          <w:b/>
+          <w:i w:val="0"/>
+          <w:sz w:val="22"/>
+        </w:rPr>
+        <w:t>Prompt:</w:t>
+      </w:r>
+    </w:p>
+    <w:p>
+      <w:pPr>
+        <w:spacing w:after="120"/>
+      </w:pPr>
+      <w:r>
+        <w:rPr>
+          <w:rFonts w:ascii="Calibri" w:hAnsi="Calibri" w:eastAsia="Calibri"/>
+          <w:b w:val="0"/>
+          <w:i/>
+          <w:sz w:val="22"/>
+        </w:rPr>
+        <w:t>“Generate functional risks and edge cases for SauceDemo checkout (info form → overview → finish). Include empty cart, whitespace, postal formats, back-button after complete, and tax math. Mark which need live proof.”</w:t>
+      </w:r>
+    </w:p>
+    <w:p>
+      <w:pPr>
+        <w:spacing w:after="120"/>
+      </w:pPr>
+      <w:r>
+        <w:rPr>
+          <w:rFonts w:ascii="Calibri" w:hAnsi="Calibri" w:eastAsia="Calibri"/>
+          <w:b w:val="0"/>
+          <w:i w:val="0"/>
+          <w:sz w:val="22"/>
+        </w:rPr>
+        <w:t>Purpose: Convert AI edge-case ideation into concrete checkout experiments.</w:t>
+      </w:r>
+    </w:p>
+    <w:p>
+      <w:pPr>
+        <w:spacing w:after="120"/>
+      </w:pPr>
+      <w:r>
+        <w:rPr>
+          <w:rFonts w:ascii="Calibri" w:hAnsi="Calibri" w:eastAsia="Calibri"/>
+          <w:b w:val="0"/>
+          <w:i w:val="0"/>
+          <w:sz w:val="22"/>
+        </w:rPr>
+        <w:t>Useful AI output: Suggested empty-cart checkout, whitespace names, invalid zip, tax rounding, re-submit via Back.</w:t>
+      </w:r>
+    </w:p>
+    <w:p>
+      <w:pPr>
+        <w:spacing w:after="120"/>
+      </w:pPr>
+      <w:r>
+        <w:rPr>
+          <w:rFonts w:ascii="Calibri" w:hAnsi="Calibri" w:eastAsia="Calibri"/>
+          <w:b w:val="0"/>
+          <w:i w:val="0"/>
+          <w:sz w:val="22"/>
+        </w:rPr>
+        <w:t>What I tested / changed / rejected / validated: Validated as bugs: empty cart $0 order, whitespace accepted, zip “!!!” accepted, Back+Finish replay. Validated as pass: 8% tax. Tax idea confirmed correct — no change needed.</w:t>
+      </w:r>
+    </w:p>
+    <w:p>
+      <w:pPr>
+        <w:pStyle w:val="Heading3"/>
+      </w:pPr>
+      <w:r>
+        <w:rPr>
+          <w:rFonts w:ascii="Calibri" w:hAnsi="Calibri" w:eastAsia="Calibri"/>
+          <w:b/>
+          <w:sz w:val="24"/>
+        </w:rPr>
+        <w:t>Prompt 3 — Dynamic Catalog scout</w:t>
+      </w:r>
+    </w:p>
+    <w:p>
+      <w:pPr>
+        <w:spacing w:after="40"/>
+      </w:pPr>
+      <w:r>
+        <w:rPr>
+          <w:rFonts w:ascii="Calibri" w:hAnsi="Calibri" w:eastAsia="Calibri"/>
+          <w:b/>
+          <w:i w:val="0"/>
+          <w:sz w:val="22"/>
+        </w:rPr>
+        <w:t>Prompt:</w:t>
+      </w:r>
+    </w:p>
+    <w:p>
+      <w:pPr>
+        <w:spacing w:after="120"/>
+      </w:pPr>
+      <w:r>
+        <w:rPr>
+          <w:rFonts w:ascii="Calibri" w:hAnsi="Calibri" w:eastAsia="Calibri"/>
+          <w:b w:val="0"/>
+          <w:i/>
+          <w:sz w:val="22"/>
+        </w:rPr>
+        <w:t>“After login, the menu has Dynamic Catalog → Lazy Load / Spinner / Slider. What should I explore for data integrity, loading UX, a11y, and purchase flow gaps? Discard ideas if those pages are browse-only.”</w:t>
+      </w:r>
+    </w:p>
+    <w:p>
+      <w:pPr>
+        <w:spacing w:after="120"/>
+      </w:pPr>
+      <w:r>
+        <w:rPr>
+          <w:rFonts w:ascii="Calibri" w:hAnsi="Calibri" w:eastAsia="Calibri"/>
+          <w:b w:val="0"/>
+          <w:i w:val="0"/>
+          <w:sz w:val="22"/>
+        </w:rPr>
+        <w:t>Purpose: Investigate a less obvious, higher-novelty surface with AI as a scout.</w:t>
+      </w:r>
+    </w:p>
+    <w:p>
+      <w:pPr>
+        <w:spacing w:after="120"/>
+      </w:pPr>
+      <w:r>
+        <w:rPr>
+          <w:rFonts w:ascii="Calibri" w:hAnsi="Calibri" w:eastAsia="Calibri"/>
+          <w:b w:val="0"/>
+          <w:i w:val="0"/>
+          <w:sz w:val="22"/>
+        </w:rPr>
+        <w:t>Useful AI output: Flagged infinite-scroll duplicates, spinner leftovers, slider keyboard/a11y, missing Add to cart.</w:t>
+      </w:r>
+    </w:p>
+    <w:p>
+      <w:pPr>
+        <w:spacing w:after="120"/>
+      </w:pPr>
+      <w:r>
+        <w:rPr>
+          <w:rFonts w:ascii="Calibri" w:hAnsi="Calibri" w:eastAsia="Calibri"/>
+          <w:b w:val="0"/>
+          <w:i w:val="0"/>
+          <w:sz w:val="22"/>
+        </w:rPr>
+        <w:t>What I tested / changed / rejected / validated: Validated duplicate Red T-Shirt (L); all slider dots a11y-current; browse-only. Treated missing Add to cart as limitation, not defect. Keyboard ArrowLeft did not move slider — kept as open follow-up.</w:t>
+      </w:r>
+    </w:p>
+    <w:p>
+      <w:pPr>
+        <w:pStyle w:val="Heading3"/>
+      </w:pPr>
+      <w:r>
+        <w:rPr>
+          <w:rFonts w:ascii="Calibri" w:hAnsi="Calibri" w:eastAsia="Calibri"/>
+          <w:b/>
+          <w:sz w:val="24"/>
+        </w:rPr>
+        <w:t>Prompt 4 — Login / session risks (scoped)</w:t>
+      </w:r>
+    </w:p>
+    <w:p>
+      <w:pPr>
+        <w:spacing w:after="40"/>
+      </w:pPr>
+      <w:r>
+        <w:rPr>
+          <w:rFonts w:ascii="Calibri" w:hAnsi="Calibri" w:eastAsia="Calibri"/>
+          <w:b/>
+          <w:i w:val="0"/>
+          <w:sz w:val="22"/>
+        </w:rPr>
+        <w:t>Prompt:</w:t>
+      </w:r>
+    </w:p>
+    <w:p>
+      <w:pPr>
+        <w:spacing w:after="120"/>
+      </w:pPr>
+      <w:r>
+        <w:rPr>
+          <w:rFonts w:ascii="Calibri" w:hAnsi="Calibri" w:eastAsia="Calibri"/>
+          <w:b w:val="0"/>
+          <w:i/>
+          <w:sz w:val="22"/>
+        </w:rPr>
+        <w:t>“Propose login/UX and session risks for SauceDemo: empty fields, partial credentials, locked_out_user, and direct URL access after logout. Ignore SQL injection unless the UI gives a real reason to prioritize it.”</w:t>
+      </w:r>
+    </w:p>
+    <w:p>
+      <w:pPr>
+        <w:spacing w:after="120"/>
+      </w:pPr>
+      <w:r>
+        <w:rPr>
+          <w:rFonts w:ascii="Calibri" w:hAnsi="Calibri" w:eastAsia="Calibri"/>
+          <w:b w:val="0"/>
+          <w:i w:val="0"/>
+          <w:sz w:val="22"/>
+        </w:rPr>
+        <w:t>Purpose: Cover auth without wasting time on generic security folklore.</w:t>
+      </w:r>
+    </w:p>
+    <w:p>
+      <w:pPr>
+        <w:spacing w:after="120"/>
+      </w:pPr>
+      <w:r>
+        <w:rPr>
+          <w:rFonts w:ascii="Calibri" w:hAnsi="Calibri" w:eastAsia="Calibri"/>
+          <w:b w:val="0"/>
+          <w:i w:val="0"/>
+          <w:sz w:val="22"/>
+        </w:rPr>
+        <w:t>Useful AI output: Required-field messaging, locked-out persona, route guards, misleading error chrome.</w:t>
+      </w:r>
+    </w:p>
+    <w:p>
+      <w:pPr>
+        <w:spacing w:after="120"/>
+      </w:pPr>
+      <w:r>
+        <w:rPr>
+          <w:rFonts w:ascii="Calibri" w:hAnsi="Calibri" w:eastAsia="Calibri"/>
+          <w:b w:val="0"/>
+          <w:i w:val="0"/>
+          <w:sz w:val="22"/>
+        </w:rPr>
+        <w:t>What I tested / changed / rejected / validated: Validated required-field errors, locked_out_user blocked, route guards. Confirmed UX issue: both fields show red X when only one is wrong. Rejected SQL-injection deep dive as out of scope.</w:t>
+      </w:r>
+    </w:p>
+    <w:p>
+      <w:pPr>
+        <w:pStyle w:val="Heading3"/>
+      </w:pPr>
+      <w:r>
+        <w:rPr>
+          <w:rFonts w:ascii="Calibri" w:hAnsi="Calibri" w:eastAsia="Calibri"/>
+          <w:b/>
+          <w:sz w:val="24"/>
+        </w:rPr>
+        <w:t>Prompt 5 — Explicit discard pass</w:t>
+      </w:r>
+    </w:p>
+    <w:p>
+      <w:pPr>
+        <w:spacing w:after="40"/>
+      </w:pPr>
+      <w:r>
+        <w:rPr>
+          <w:rFonts w:ascii="Calibri" w:hAnsi="Calibri" w:eastAsia="Calibri"/>
+          <w:b/>
+          <w:i w:val="0"/>
+          <w:sz w:val="22"/>
+        </w:rPr>
+        <w:t>Prompt:</w:t>
+      </w:r>
+    </w:p>
+    <w:p>
+      <w:pPr>
+        <w:spacing w:after="120"/>
+      </w:pPr>
+      <w:r>
+        <w:rPr>
+          <w:rFonts w:ascii="Calibri" w:hAnsi="Calibri" w:eastAsia="Calibri"/>
+          <w:b w:val="0"/>
+          <w:i/>
+          <w:sz w:val="22"/>
+        </w:rPr>
+        <w:t>“Which of these AI ideas should I discard for SauceDemo and why: multi-currency, stock limits, email confirmation, multi-user cart sync, real card processing? Base the answer on what the app actually exposes.”</w:t>
+      </w:r>
+    </w:p>
+    <w:p>
+      <w:pPr>
+        <w:spacing w:after="120"/>
+      </w:pPr>
+      <w:r>
+        <w:rPr>
+          <w:rFonts w:ascii="Calibri" w:hAnsi="Calibri" w:eastAsia="Calibri"/>
+          <w:b w:val="0"/>
+          <w:i w:val="0"/>
+          <w:sz w:val="22"/>
+        </w:rPr>
+        <w:t>Purpose: Force explicit rejection of AI noise before writing findings.</w:t>
+      </w:r>
+    </w:p>
+    <w:p>
+      <w:pPr>
+        <w:spacing w:after="120"/>
+      </w:pPr>
+      <w:r>
+        <w:rPr>
+          <w:rFonts w:ascii="Calibri" w:hAnsi="Calibri" w:eastAsia="Calibri"/>
+          <w:b w:val="0"/>
+          <w:i w:val="0"/>
+          <w:sz w:val="22"/>
+        </w:rPr>
+        <w:t>Useful AI output: Discard list with rationale tied to missing UI/capabilities.</w:t>
+      </w:r>
+    </w:p>
+    <w:p>
+      <w:pPr>
+        <w:spacing w:after="120"/>
+      </w:pPr>
+      <w:r>
+        <w:rPr>
+          <w:rFonts w:ascii="Calibri" w:hAnsi="Calibri" w:eastAsia="Calibri"/>
+          <w:b w:val="0"/>
+          <w:i w:val="0"/>
+          <w:sz w:val="22"/>
+        </w:rPr>
+        <w:t>What I tested / changed / rejected / validated: All five discarded after live observation (no locale/currency, no stock, no email at checkout, cart is localStorage ID array, payment mocked). Prevented false findings in the report.</w:t>
+      </w:r>
+    </w:p>
+    <w:p>
+      <w:pPr>
+        <w:pStyle w:val="Heading2"/>
+      </w:pPr>
+      <w:r>
+        <w:rPr>
+          <w:rFonts w:ascii="Calibri" w:hAnsi="Calibri" w:eastAsia="Calibri"/>
+          <w:b/>
+          <w:sz w:val="26"/>
+        </w:rPr>
+        <w:t>2.6 AI suggestions discarded</w:t>
+      </w:r>
+    </w:p>
+    <w:tbl>
+      <w:tblPr>
+        <w:tblStyle w:val="TableGrid"/>
+        <w:tblW w:type="auto" w:w="0"/>
+        <w:tblLook w:firstColumn="1" w:firstRow="1" w:lastColumn="0" w:lastRow="0" w:noHBand="0" w:noVBand="1" w:val="04A0"/>
+      </w:tblPr>
+      <w:tblGrid>
+        <w:gridCol w:w="4968"/>
+        <w:gridCol w:w="4968"/>
+      </w:tblGrid>
+      <w:tr>
+        <w:tc>
+          <w:tcPr>
+            <w:tcW w:type="dxa" w:w="4968"/>
+            <w:shd w:fill="1F4E79" w:val="clear"/>
+          </w:tcPr>
+          <w:p>
+            <w:r>
+              <w:rPr>
+                <w:rFonts w:ascii="Calibri" w:hAnsi="Calibri" w:eastAsia="Calibri"/>
+                <w:b/>
+                <w:color w:val="FFFFFF"/>
+                <w:sz w:val="18"/>
+              </w:rPr>
+              <w:t>Suggestion</w:t>
+            </w:r>
+          </w:p>
+        </w:tc>
+        <w:tc>
+          <w:tcPr>
+            <w:tcW w:type="dxa" w:w="4968"/>
+            <w:shd w:fill="1F4E79" w:val="clear"/>
+          </w:tcPr>
+          <w:p>
+            <w:r>
+              <w:rPr>
+                <w:rFonts w:ascii="Calibri" w:hAnsi="Calibri" w:eastAsia="Calibri"/>
+                <w:b/>
+                <w:color w:val="FFFFFF"/>
+                <w:sz w:val="18"/>
+              </w:rPr>
+              <w:t>Why discarded</w:t>
+            </w:r>
+          </w:p>
+        </w:tc>
+      </w:tr>
+      <w:tr>
+        <w:tc>
+          <w:tcPr>
+            <w:tcW w:type="dxa" w:w="4968"/>
+          </w:tcPr>
+          <w:p>
+            <w:r>
+              <w:rPr>
+                <w:rFonts w:ascii="Calibri" w:hAnsi="Calibri" w:eastAsia="Calibri"/>
+                <w:b w:val="0"/>
+                <w:sz w:val="18"/>
+              </w:rPr>
+              <w:t>Deep payment / fraud / card-processor tests</w:t>
+            </w:r>
+          </w:p>
+        </w:tc>
+        <w:tc>
+          <w:tcPr>
+            <w:tcW w:type="dxa" w:w="4968"/>
+          </w:tcPr>
+          <w:p>
+            <w:r>
+              <w:rPr>
+                <w:rFonts w:ascii="Calibri" w:hAnsi="Calibri" w:eastAsia="Calibri"/>
+                <w:b w:val="0"/>
+                <w:sz w:val="18"/>
+              </w:rPr>
+              <w:t>Payment is mocked (“SauceCard #31337”); no real processor or card form</w:t>
+            </w:r>
+          </w:p>
+        </w:tc>
+      </w:tr>
+      <w:tr>
+        <w:tc>
+          <w:tcPr>
+            <w:tcW w:type="dxa" w:w="4968"/>
+          </w:tcPr>
+          <w:p>
+            <w:r>
+              <w:rPr>
+                <w:rFonts w:ascii="Calibri" w:hAnsi="Calibri" w:eastAsia="Calibri"/>
+                <w:b w:val="0"/>
+                <w:sz w:val="18"/>
+              </w:rPr>
+              <w:t>SQL injection / auth bypass fuzzing as primary focus</w:t>
+            </w:r>
+          </w:p>
+        </w:tc>
+        <w:tc>
+          <w:tcPr>
+            <w:tcW w:type="dxa" w:w="4968"/>
+          </w:tcPr>
+          <w:p>
+            <w:r>
+              <w:rPr>
+                <w:rFonts w:ascii="Calibri" w:hAnsi="Calibri" w:eastAsia="Calibri"/>
+                <w:b w:val="0"/>
+                <w:sz w:val="18"/>
+              </w:rPr>
+              <w:t>Demo credential list + cookie session-username; not worth session budget</w:t>
+            </w:r>
+          </w:p>
+        </w:tc>
+      </w:tr>
+      <w:tr>
+        <w:tc>
+          <w:tcPr>
+            <w:tcW w:type="dxa" w:w="4968"/>
+          </w:tcPr>
+          <w:p>
+            <w:r>
+              <w:rPr>
+                <w:rFonts w:ascii="Calibri" w:hAnsi="Calibri" w:eastAsia="Calibri"/>
+                <w:b w:val="0"/>
+                <w:sz w:val="18"/>
+              </w:rPr>
+              <w:t>i18n / multi-currency checkout</w:t>
+            </w:r>
+          </w:p>
+        </w:tc>
+        <w:tc>
+          <w:tcPr>
+            <w:tcW w:type="dxa" w:w="4968"/>
+          </w:tcPr>
+          <w:p>
+            <w:r>
+              <w:rPr>
+                <w:rFonts w:ascii="Calibri" w:hAnsi="Calibri" w:eastAsia="Calibri"/>
+                <w:b w:val="0"/>
+                <w:sz w:val="18"/>
+              </w:rPr>
+              <w:t>No locale or currency switcher found</w:t>
+            </w:r>
+          </w:p>
+        </w:tc>
+      </w:tr>
+      <w:tr>
+        <w:tc>
+          <w:tcPr>
+            <w:tcW w:type="dxa" w:w="4968"/>
+          </w:tcPr>
+          <w:p>
+            <w:r>
+              <w:rPr>
+                <w:rFonts w:ascii="Calibri" w:hAnsi="Calibri" w:eastAsia="Calibri"/>
+                <w:b w:val="0"/>
+                <w:sz w:val="18"/>
+              </w:rPr>
+              <w:t>Inventory stock / oversell limits</w:t>
+            </w:r>
+          </w:p>
+        </w:tc>
+        <w:tc>
+          <w:tcPr>
+            <w:tcW w:type="dxa" w:w="4968"/>
+          </w:tcPr>
+          <w:p>
+            <w:r>
+              <w:rPr>
+                <w:rFonts w:ascii="Calibri" w:hAnsi="Calibri" w:eastAsia="Calibri"/>
+                <w:b w:val="0"/>
+                <w:sz w:val="18"/>
+              </w:rPr>
+              <w:t>No stock counters or purchase limits in UI or cart model</w:t>
+            </w:r>
+          </w:p>
+        </w:tc>
+      </w:tr>
+      <w:tr>
+        <w:tc>
+          <w:tcPr>
+            <w:tcW w:type="dxa" w:w="4968"/>
+          </w:tcPr>
+          <w:p>
+            <w:r>
+              <w:rPr>
+                <w:rFonts w:ascii="Calibri" w:hAnsi="Calibri" w:eastAsia="Calibri"/>
+                <w:b w:val="0"/>
+                <w:sz w:val="18"/>
+              </w:rPr>
+              <w:t>Multi-user cart sync / concurrency</w:t>
+            </w:r>
+          </w:p>
+        </w:tc>
+        <w:tc>
+          <w:tcPr>
+            <w:tcW w:type="dxa" w:w="4968"/>
+          </w:tcPr>
+          <w:p>
+            <w:r>
+              <w:rPr>
+                <w:rFonts w:ascii="Calibri" w:hAnsi="Calibri" w:eastAsia="Calibri"/>
+                <w:b w:val="0"/>
+                <w:sz w:val="18"/>
+              </w:rPr>
+              <w:t>Cart is localStorage product-ID list on the client only</w:t>
+            </w:r>
+          </w:p>
+        </w:tc>
+      </w:tr>
+      <w:tr>
+        <w:tc>
+          <w:tcPr>
+            <w:tcW w:type="dxa" w:w="4968"/>
+          </w:tcPr>
+          <w:p>
+            <w:r>
+              <w:rPr>
+                <w:rFonts w:ascii="Calibri" w:hAnsi="Calibri" w:eastAsia="Calibri"/>
+                <w:b w:val="0"/>
+                <w:sz w:val="18"/>
+              </w:rPr>
+              <w:t>Email / order confirmation delivery</w:t>
+            </w:r>
+          </w:p>
+        </w:tc>
+        <w:tc>
+          <w:tcPr>
+            <w:tcW w:type="dxa" w:w="4968"/>
+          </w:tcPr>
+          <w:p>
+            <w:r>
+              <w:rPr>
+                <w:rFonts w:ascii="Calibri" w:hAnsi="Calibri" w:eastAsia="Calibri"/>
+                <w:b w:val="0"/>
+                <w:sz w:val="18"/>
+              </w:rPr>
+              <w:t>Checkout collects name + zip only; no email field</w:t>
+            </w:r>
+          </w:p>
+        </w:tc>
+      </w:tr>
+    </w:tbl>
+    <w:p/>
+    <w:p>
+      <w:pPr>
+        <w:pStyle w:val="Heading1"/>
+      </w:pPr>
+      <w:r>
+        <w:rPr>
+          <w:rFonts w:ascii="Calibri" w:hAnsi="Calibri" w:eastAsia="Calibri"/>
+          <w:b/>
+          <w:sz w:val="32"/>
+        </w:rPr>
+        <w:t>3. Task B — Defect report (top 5)</w:t>
       </w:r>
     </w:p>
     <w:p>
@@ -1837,364 +3248,6 @@
           <w:b/>
           <w:sz w:val="32"/>
         </w:rPr>
-        <w:t>3. Task A — AI prompt / usage log</w:t>
-      </w:r>
-    </w:p>
-    <w:p>
-      <w:pPr>
-        <w:pStyle w:val="Heading3"/>
-      </w:pPr>
-      <w:r>
-        <w:rPr>
-          <w:rFonts w:ascii="Calibri" w:hAnsi="Calibri" w:eastAsia="Calibri"/>
-          <w:b/>
-          <w:sz w:val="24"/>
-        </w:rPr>
-        <w:t>Prompt 1 — Risk prioritization</w:t>
-      </w:r>
-    </w:p>
-    <w:p>
-      <w:pPr>
-        <w:spacing w:after="120"/>
-      </w:pPr>
-      <w:r>
-        <w:rPr>
-          <w:rFonts w:ascii="Calibri" w:hAnsi="Calibri" w:eastAsia="Calibri"/>
-          <w:b w:val="0"/>
-          <w:i/>
-          <w:sz w:val="22"/>
-        </w:rPr>
-        <w:t>Prompt: Identify highest-risk SauceDemo journeys for standard_user; challenge real-commerce assumptions.</w:t>
-      </w:r>
-    </w:p>
-    <w:p>
-      <w:pPr>
-        <w:spacing w:after="120"/>
-      </w:pPr>
-      <w:r>
-        <w:rPr>
-          <w:rFonts w:ascii="Calibri" w:hAnsi="Calibri" w:eastAsia="Calibri"/>
-          <w:b w:val="0"/>
-          <w:i w:val="0"/>
-          <w:sz w:val="22"/>
-        </w:rPr>
-        <w:t>Purpose: Focus session on impact.</w:t>
-      </w:r>
-    </w:p>
-    <w:p>
-      <w:pPr>
-        <w:spacing w:after="120"/>
-      </w:pPr>
-      <w:r>
-        <w:rPr>
-          <w:rFonts w:ascii="Calibri" w:hAnsi="Calibri" w:eastAsia="Calibri"/>
-          <w:b w:val="0"/>
-          <w:i w:val="0"/>
-          <w:sz w:val="22"/>
-        </w:rPr>
-        <w:t>Useful AI output: Checkout/cart top; payment likely mocked.</w:t>
-      </w:r>
-    </w:p>
-    <w:p>
-      <w:pPr>
-        <w:spacing w:after="120"/>
-      </w:pPr>
-      <w:r>
-        <w:rPr>
-          <w:rFonts w:ascii="Calibri" w:hAnsi="Calibri" w:eastAsia="Calibri"/>
-          <w:b w:val="0"/>
-          <w:i w:val="0"/>
-          <w:sz w:val="22"/>
-        </w:rPr>
-        <w:t>Tested / changed / rejected / validated: Validated checkout/cart risk. Rejected deep payment/fraud focus.</w:t>
-      </w:r>
-    </w:p>
-    <w:p>
-      <w:pPr>
-        <w:pStyle w:val="Heading3"/>
-      </w:pPr>
-      <w:r>
-        <w:rPr>
-          <w:rFonts w:ascii="Calibri" w:hAnsi="Calibri" w:eastAsia="Calibri"/>
-          <w:b/>
-          <w:sz w:val="24"/>
-        </w:rPr>
-        <w:t>Prompt 2 — Checkout edge cases</w:t>
-      </w:r>
-    </w:p>
-    <w:p>
-      <w:pPr>
-        <w:spacing w:after="120"/>
-      </w:pPr>
-      <w:r>
-        <w:rPr>
-          <w:rFonts w:ascii="Calibri" w:hAnsi="Calibri" w:eastAsia="Calibri"/>
-          <w:b w:val="0"/>
-          <w:i/>
-          <w:sz w:val="22"/>
-        </w:rPr>
-        <w:t>Prompt: Generate checkout risks: empty cart, whitespace, postal format, Back after complete, tax math.</w:t>
-      </w:r>
-    </w:p>
-    <w:p>
-      <w:pPr>
-        <w:spacing w:after="120"/>
-      </w:pPr>
-      <w:r>
-        <w:rPr>
-          <w:rFonts w:ascii="Calibri" w:hAnsi="Calibri" w:eastAsia="Calibri"/>
-          <w:b w:val="0"/>
-          <w:i w:val="0"/>
-          <w:sz w:val="22"/>
-        </w:rPr>
-        <w:t>Purpose: Convert ideation to experiments.</w:t>
-      </w:r>
-    </w:p>
-    <w:p>
-      <w:pPr>
-        <w:spacing w:after="120"/>
-      </w:pPr>
-      <w:r>
-        <w:rPr>
-          <w:rFonts w:ascii="Calibri" w:hAnsi="Calibri" w:eastAsia="Calibri"/>
-          <w:b w:val="0"/>
-          <w:i w:val="0"/>
-          <w:sz w:val="22"/>
-        </w:rPr>
-        <w:t>Useful AI output: Empty cart, whitespace, !!! zip, Back+Finish, tax.</w:t>
-      </w:r>
-    </w:p>
-    <w:p>
-      <w:pPr>
-        <w:spacing w:after="120"/>
-      </w:pPr>
-      <w:r>
-        <w:rPr>
-          <w:rFonts w:ascii="Calibri" w:hAnsi="Calibri" w:eastAsia="Calibri"/>
-          <w:b w:val="0"/>
-          <w:i w:val="0"/>
-          <w:sz w:val="22"/>
-        </w:rPr>
-        <w:t>Tested / changed / rejected / validated: Validated DEF-01–04 as bugs; tax 8% confirmed pass.</w:t>
-      </w:r>
-    </w:p>
-    <w:p>
-      <w:pPr>
-        <w:pStyle w:val="Heading3"/>
-      </w:pPr>
-      <w:r>
-        <w:rPr>
-          <w:rFonts w:ascii="Calibri" w:hAnsi="Calibri" w:eastAsia="Calibri"/>
-          <w:b/>
-          <w:sz w:val="24"/>
-        </w:rPr>
-        <w:t>Prompt 3 — Dynamic Catalog</w:t>
-      </w:r>
-    </w:p>
-    <w:p>
-      <w:pPr>
-        <w:spacing w:after="120"/>
-      </w:pPr>
-      <w:r>
-        <w:rPr>
-          <w:rFonts w:ascii="Calibri" w:hAnsi="Calibri" w:eastAsia="Calibri"/>
-          <w:b w:val="0"/>
-          <w:i/>
-          <w:sz w:val="22"/>
-        </w:rPr>
-        <w:t>Prompt: Explore Lazy/Spinner/Slider for data integrity, loading UX, a11y; discard if browse-only.</w:t>
-      </w:r>
-    </w:p>
-    <w:p>
-      <w:pPr>
-        <w:spacing w:after="120"/>
-      </w:pPr>
-      <w:r>
-        <w:rPr>
-          <w:rFonts w:ascii="Calibri" w:hAnsi="Calibri" w:eastAsia="Calibri"/>
-          <w:b w:val="0"/>
-          <w:i w:val="0"/>
-          <w:sz w:val="22"/>
-        </w:rPr>
-        <w:t>Purpose: Scout newer surface.</w:t>
-      </w:r>
-    </w:p>
-    <w:p>
-      <w:pPr>
-        <w:spacing w:after="120"/>
-      </w:pPr>
-      <w:r>
-        <w:rPr>
-          <w:rFonts w:ascii="Calibri" w:hAnsi="Calibri" w:eastAsia="Calibri"/>
-          <w:b w:val="0"/>
-          <w:i w:val="0"/>
-          <w:sz w:val="22"/>
-        </w:rPr>
-        <w:t>Useful AI output: Duplicates, a11y, missing Add to cart.</w:t>
-      </w:r>
-    </w:p>
-    <w:p>
-      <w:pPr>
-        <w:spacing w:after="120"/>
-      </w:pPr>
-      <w:r>
-        <w:rPr>
-          <w:rFonts w:ascii="Calibri" w:hAnsi="Calibri" w:eastAsia="Calibri"/>
-          <w:b w:val="0"/>
-          <w:i w:val="0"/>
-          <w:sz w:val="22"/>
-        </w:rPr>
-        <w:t>Tested / changed / rejected / validated: Validated DEF-05. Treated missing Add to cart as limitation.</w:t>
-      </w:r>
-    </w:p>
-    <w:p>
-      <w:pPr>
-        <w:pStyle w:val="Heading3"/>
-      </w:pPr>
-      <w:r>
-        <w:rPr>
-          <w:rFonts w:ascii="Calibri" w:hAnsi="Calibri" w:eastAsia="Calibri"/>
-          <w:b/>
-          <w:sz w:val="24"/>
-        </w:rPr>
-        <w:t>Prompt 4 — Auth scoped</w:t>
-      </w:r>
-    </w:p>
-    <w:p>
-      <w:pPr>
-        <w:spacing w:after="120"/>
-      </w:pPr>
-      <w:r>
-        <w:rPr>
-          <w:rFonts w:ascii="Calibri" w:hAnsi="Calibri" w:eastAsia="Calibri"/>
-          <w:b w:val="0"/>
-          <w:i/>
-          <w:sz w:val="22"/>
-        </w:rPr>
-        <w:t>Prompt: Login/session risks; ignore SQL injection unless UI justifies it.</w:t>
-      </w:r>
-    </w:p>
-    <w:p>
-      <w:pPr>
-        <w:spacing w:after="120"/>
-      </w:pPr>
-      <w:r>
-        <w:rPr>
-          <w:rFonts w:ascii="Calibri" w:hAnsi="Calibri" w:eastAsia="Calibri"/>
-          <w:b w:val="0"/>
-          <w:i w:val="0"/>
-          <w:sz w:val="22"/>
-        </w:rPr>
-        <w:t>Purpose: Cover auth without folklore.</w:t>
-      </w:r>
-    </w:p>
-    <w:p>
-      <w:pPr>
-        <w:spacing w:after="120"/>
-      </w:pPr>
-      <w:r>
-        <w:rPr>
-          <w:rFonts w:ascii="Calibri" w:hAnsi="Calibri" w:eastAsia="Calibri"/>
-          <w:b w:val="0"/>
-          <w:i w:val="0"/>
-          <w:sz w:val="22"/>
-        </w:rPr>
-        <w:t>Useful AI output: Required fields, locked_out_user, route guards.</w:t>
-      </w:r>
-    </w:p>
-    <w:p>
-      <w:pPr>
-        <w:spacing w:after="120"/>
-      </w:pPr>
-      <w:r>
-        <w:rPr>
-          <w:rFonts w:ascii="Calibri" w:hAnsi="Calibri" w:eastAsia="Calibri"/>
-          <w:b w:val="0"/>
-          <w:i w:val="0"/>
-          <w:sz w:val="22"/>
-        </w:rPr>
-        <w:t>Tested / changed / rejected / validated: Validated guards + locked_out. Rejected SQL deep dive.</w:t>
-      </w:r>
-    </w:p>
-    <w:p>
-      <w:pPr>
-        <w:pStyle w:val="Heading3"/>
-      </w:pPr>
-      <w:r>
-        <w:rPr>
-          <w:rFonts w:ascii="Calibri" w:hAnsi="Calibri" w:eastAsia="Calibri"/>
-          <w:b/>
-          <w:sz w:val="24"/>
-        </w:rPr>
-        <w:t>Prompt 5 — Discard pass</w:t>
-      </w:r>
-    </w:p>
-    <w:p>
-      <w:pPr>
-        <w:spacing w:after="120"/>
-      </w:pPr>
-      <w:r>
-        <w:rPr>
-          <w:rFonts w:ascii="Calibri" w:hAnsi="Calibri" w:eastAsia="Calibri"/>
-          <w:b w:val="0"/>
-          <w:i/>
-          <w:sz w:val="22"/>
-        </w:rPr>
-        <w:t>Prompt: Discard multi-currency, stock, email confirmation, multi-user cart, real cards — based on app reality.</w:t>
-      </w:r>
-    </w:p>
-    <w:p>
-      <w:pPr>
-        <w:spacing w:after="120"/>
-      </w:pPr>
-      <w:r>
-        <w:rPr>
-          <w:rFonts w:ascii="Calibri" w:hAnsi="Calibri" w:eastAsia="Calibri"/>
-          <w:b w:val="0"/>
-          <w:i w:val="0"/>
-          <w:sz w:val="22"/>
-        </w:rPr>
-        <w:t>Purpose: Kill unsupported AI ideas.</w:t>
-      </w:r>
-    </w:p>
-    <w:p>
-      <w:pPr>
-        <w:spacing w:after="120"/>
-      </w:pPr>
-      <w:r>
-        <w:rPr>
-          <w:rFonts w:ascii="Calibri" w:hAnsi="Calibri" w:eastAsia="Calibri"/>
-          <w:b w:val="0"/>
-          <w:i w:val="0"/>
-          <w:sz w:val="22"/>
-        </w:rPr>
-        <w:t>Useful AI output: Discard list with rationale.</w:t>
-      </w:r>
-    </w:p>
-    <w:p>
-      <w:pPr>
-        <w:spacing w:after="120"/>
-      </w:pPr>
-      <w:r>
-        <w:rPr>
-          <w:rFonts w:ascii="Calibri" w:hAnsi="Calibri" w:eastAsia="Calibri"/>
-          <w:b w:val="0"/>
-          <w:i w:val="0"/>
-          <w:sz w:val="22"/>
-        </w:rPr>
-        <w:t>Tested / changed / rejected / validated: All five discarded after live observation.</w:t>
-      </w:r>
-    </w:p>
-    <w:p>
-      <w:pPr>
-        <w:pStyle w:val="Heading1"/>
-      </w:pPr>
-      <w:r>
-        <w:rPr>
-          <w:rFonts w:ascii="Calibri" w:hAnsi="Calibri" w:eastAsia="Calibri"/>
-          <w:b/>
-          <w:sz w:val="32"/>
-        </w:rPr>
         <w:t>4. Task C — Automated test</w:t>
       </w:r>
     </w:p>

</xml_diff>